<commit_message>
Update capstone proposal demo format
Update Capstone_Proposal_DemoFormat files: edited the .docx and regenerated the matching .pdf to reflect the revised demo format.
</commit_message>
<xml_diff>
--- a/Proposal/Capstone_Proposal_DemoFormat.docx
+++ b/Proposal/Capstone_Proposal_DemoFormat.docx
@@ -1330,6 +1330,7 @@
                 <w:bCs/>
                 <w:i/>
                 <w:iCs/>
+                <w:color w:val="5B9BD5" w:themeColor="accent1"/>
                 <w:sz w:val="22"/>
                 <w:szCs w:val="22"/>
               </w:rPr>
@@ -1341,6 +1342,7 @@
                 <w:bCs/>
                 <w:i/>
                 <w:iCs/>
+                <w:color w:val="5B9BD5" w:themeColor="accent1"/>
                 <w:sz w:val="22"/>
                 <w:szCs w:val="22"/>
                 <w:lang w:val="en-US"/>
@@ -1355,6 +1357,7 @@
                 <w:bCs/>
                 <w:i/>
                 <w:iCs/>
+                <w:color w:val="5B9BD5" w:themeColor="accent1"/>
                 <w:sz w:val="22"/>
                 <w:szCs w:val="22"/>
                 <w:lang w:val="en-US"/>
@@ -1369,6 +1372,7 @@
                 <w:bCs/>
                 <w:i/>
                 <w:iCs/>
+                <w:color w:val="5B9BD5" w:themeColor="accent1"/>
                 <w:sz w:val="22"/>
                 <w:szCs w:val="22"/>
                 <w:lang w:val="en-US"/>
@@ -1518,6 +1522,7 @@
                 <w:bCs/>
                 <w:i/>
                 <w:iCs/>
+                <w:color w:val="5B9BD5" w:themeColor="accent1"/>
                 <w:sz w:val="22"/>
                 <w:szCs w:val="22"/>
               </w:rPr>
@@ -1529,6 +1534,7 @@
                 <w:bCs/>
                 <w:i/>
                 <w:iCs/>
+                <w:color w:val="5B9BD5" w:themeColor="accent1"/>
                 <w:sz w:val="22"/>
                 <w:szCs w:val="22"/>
                 <w:lang w:val="en-US"/>
@@ -1543,6 +1549,7 @@
                 <w:bCs/>
                 <w:i/>
                 <w:iCs/>
+                <w:color w:val="5B9BD5" w:themeColor="accent1"/>
                 <w:sz w:val="22"/>
                 <w:szCs w:val="22"/>
                 <w:lang w:val="en-US"/>
@@ -1557,6 +1564,7 @@
                 <w:bCs/>
                 <w:i/>
                 <w:iCs/>
+                <w:color w:val="5B9BD5" w:themeColor="accent1"/>
                 <w:sz w:val="22"/>
                 <w:szCs w:val="22"/>
                 <w:lang w:val="en-US"/>
@@ -1571,6 +1579,7 @@
                 <w:bCs/>
                 <w:i/>
                 <w:iCs/>
+                <w:color w:val="5B9BD5" w:themeColor="accent1"/>
                 <w:sz w:val="22"/>
                 <w:szCs w:val="22"/>
                 <w:lang w:val="en-US"/>
@@ -1641,11 +1650,13 @@
         <w:spacing w:before="200"/>
         <w:rPr>
           <w:rFonts w:ascii="Times New Roman" w:hAnsi="Times New Roman" w:cs="Times New Roman"/>
-        </w:rPr>
-      </w:pPr>
-      <w:r>
-        <w:rPr>
-          <w:rFonts w:ascii="Times New Roman" w:hAnsi="Times New Roman" w:cs="Times New Roman"/>
+          <w:color w:val="5B9BD5" w:themeColor="accent1"/>
+        </w:rPr>
+      </w:pPr>
+      <w:r>
+        <w:rPr>
+          <w:rFonts w:ascii="Times New Roman" w:hAnsi="Times New Roman" w:cs="Times New Roman"/>
+          <w:color w:val="5B9BD5" w:themeColor="accent1"/>
         </w:rPr>
         <w:lastRenderedPageBreak/>
         <w:t>1. Introduction</w:t>
@@ -1680,21 +1691,7 @@
           <w:rFonts w:ascii="Times New Roman" w:hAnsi="Times New Roman" w:cs="Times New Roman"/>
           <w:sz w:val="24"/>
         </w:rPr>
-        <w:t>Autonomous mobile robots are increasingly deployed in industrial, service, and domestic environments where they must navigate safely without human intervention. Conventional navigation systems typically rely on expensive sensor suites such as LiDAR, stereo</w:t>
-      </w:r>
-      <w:r>
-        <w:rPr>
-          <w:rFonts w:ascii="Times New Roman" w:hAnsi="Times New Roman" w:cs="Times New Roman"/>
-          <w:sz w:val="24"/>
-        </w:rPr>
-        <w:t xml:space="preserve"> depth cameras, and multi-sensor fusion architectures to perceive the environment. Although these approaches deliver high localization and mapping accuracy, their significant cost, weight, and computational overhead render them impractical for low-resource</w:t>
-      </w:r>
-      <w:r>
-        <w:rPr>
-          <w:rFonts w:ascii="Times New Roman" w:hAnsi="Times New Roman" w:cs="Times New Roman"/>
-          <w:sz w:val="24"/>
-        </w:rPr>
-        <w:t>, cost-sensitive deployment scenarios such as developing-country logistics, low-cost delivery robots, and educational robotics platforms [1][2].</w:t>
+        <w:t>Autonomous mobile robots are increasingly deployed in industrial, service, and domestic environments where they must navigate safely without human intervention. Conventional navigation systems typically rely on expensive sensor suites such as LiDAR, stereo depth cameras, and multi-sensor fusion architectures to perceive the environment. Although these approaches deliver high localization and mapping accuracy, their significant cost, weight, and computational overhead render them impractical for low-resource, cost-sensitive deployment scenarios such as developing-country logistics, low-cost delivery robots, and educational robotics platforms [1][2].</w:t>
       </w:r>
     </w:p>
     <w:p>
@@ -1711,28 +1708,7 @@
           <w:rFonts w:ascii="Times New Roman" w:hAnsi="Times New Roman" w:cs="Times New Roman"/>
           <w:sz w:val="24"/>
         </w:rPr>
-        <w:t xml:space="preserve">Vision-based navigation using only an RGB camera presents a compelling low-cost alternative; however, existing </w:t>
-      </w:r>
-      <w:r>
-        <w:rPr>
-          <w:rFonts w:ascii="Times New Roman" w:hAnsi="Times New Roman" w:cs="Times New Roman"/>
-          <w:sz w:val="24"/>
-        </w:rPr>
-        <w:t>deep learning solutions suffer from two critical shortcomings. First, they demonstrate substantial performance degradation under varying lighting conditions — including overexposure, dim lighting, and flickering environments — that are common in real-world</w:t>
-      </w:r>
-      <w:r>
-        <w:rPr>
-          <w:rFonts w:ascii="Times New Roman" w:hAnsi="Times New Roman" w:cs="Times New Roman"/>
-          <w:sz w:val="24"/>
-        </w:rPr>
-        <w:t xml:space="preserve"> deployments. Second, they lack robustness against dynamic obstacles, which are omnipresent in human-shared spaces [3][4]. There is therefore an urgent need for a lightweight, cost-effective, and simulation-validated navigation framework that uses only an </w:t>
-      </w:r>
-      <w:r>
-        <w:rPr>
-          <w:rFonts w:ascii="Times New Roman" w:hAnsi="Times New Roman" w:cs="Times New Roman"/>
-          <w:sz w:val="24"/>
-        </w:rPr>
-        <w:t>RGB camera input while maintaining acceptable navigation performance quantified through measurable metrics.</w:t>
+        <w:t>Vision-based navigation using only an RGB camera presents a compelling low-cost alternative; however, existing deep learning solutions suffer from two critical shortcomings. First, they demonstrate substantial performance degradation under varying lighting conditions — including overexposure, dim lighting, and flickering environments — that are common in real-world deployments. Second, they lack robustness against dynamic obstacles, which are omnipresent in human-shared spaces [3][4]. There is therefore an urgent need for a lightweight, cost-effective, and simulation-validated navigation framework that uses only an RGB camera input while maintaining acceptable navigation performance quantified through measurable metrics.</w:t>
       </w:r>
     </w:p>
     <w:p>
@@ -1764,35 +1740,7 @@
           <w:rFonts w:ascii="Times New Roman" w:hAnsi="Times New Roman" w:cs="Times New Roman"/>
           <w:sz w:val="24"/>
         </w:rPr>
-        <w:t>This research is motivated by the convergence of three key trends in modern robotics and artificial intelligence. First, the prolifer</w:t>
-      </w:r>
-      <w:r>
-        <w:rPr>
-          <w:rFonts w:ascii="Times New Roman" w:hAnsi="Times New Roman" w:cs="Times New Roman"/>
-          <w:sz w:val="24"/>
-        </w:rPr>
-        <w:t>ation of low-cost embedded computing platforms (e.g., NVIDIA Jetson Nano, Raspberry Pi 5) has made it technically feasible to deploy neural network inference on small, mobile robot platforms — but only if the navigation model is sufficiently lightweight to</w:t>
-      </w:r>
-      <w:r>
-        <w:rPr>
-          <w:rFonts w:ascii="Times New Roman" w:hAnsi="Times New Roman" w:cs="Times New Roman"/>
-          <w:sz w:val="24"/>
-        </w:rPr>
-        <w:t xml:space="preserve"> run in real time on constrained hardware [5]. Second, the economic imperative for affordable autonomous systems is acute in developing regions, where LiDAR-equipped robots remain prohibitively expensive. A camera-only navigation solution could democratize</w:t>
-      </w:r>
-      <w:r>
-        <w:rPr>
-          <w:rFonts w:ascii="Times New Roman" w:hAnsi="Times New Roman" w:cs="Times New Roman"/>
-          <w:sz w:val="24"/>
-        </w:rPr>
-        <w:t xml:space="preserve"> autonomous robotics by reducing per-robot sensor costs from thousands of dollars to tens of dollars. Third, the maturation of physics-based robot simulators — particularly Gazebo integrated with ROS — has reduced the barrier to rigorous navigation researc</w:t>
-      </w:r>
-      <w:r>
-        <w:rPr>
-          <w:rFonts w:ascii="Times New Roman" w:hAnsi="Times New Roman" w:cs="Times New Roman"/>
-          <w:sz w:val="24"/>
-        </w:rPr>
-        <w:t>h. Simulation-trained policies have recently been shown to surpass real-data-trained policies in success rate [6], validating the simulation-first research paradigm adopted in this work [7][8].</w:t>
+        <w:t>This research is motivated by the convergence of three key trends in modern robotics and artificial intelligence. First, the proliferation of low-cost embedded computing platforms (e.g., NVIDIA Jetson Nano, Raspberry Pi 5) has made it technically feasible to deploy neural network inference on small, mobile robot platforms — but only if the navigation model is sufficiently lightweight to run in real time on constrained hardware [5]. Second, the economic imperative for affordable autonomous systems is acute in developing regions, where LiDAR-equipped robots remain prohibitively expensive. A camera-only navigation solution could democratize autonomous robotics by reducing per-robot sensor costs from thousands of dollars to tens of dollars. Third, the maturation of physics-based robot simulators — particularly Gazebo integrated with ROS — has reduced the barrier to rigorous navigation research. Simulation-trained policies have recently been shown to surpass real-data-trained policies in success rate [6], validating the simulation-first research paradigm adopted in this work [7][8].</w:t>
       </w:r>
     </w:p>
     <w:p>
@@ -1824,35 +1772,7 @@
           <w:rFonts w:ascii="Times New Roman" w:hAnsi="Times New Roman" w:cs="Times New Roman"/>
           <w:sz w:val="24"/>
         </w:rPr>
-        <w:t>This project proposes a lightweight deep learning</w:t>
-      </w:r>
-      <w:r>
-        <w:rPr>
-          <w:rFonts w:ascii="Times New Roman" w:hAnsi="Times New Roman" w:cs="Times New Roman"/>
-          <w:sz w:val="24"/>
-        </w:rPr>
-        <w:t>-based vision-only autonomous navigation framework for a differential-drive mobile robot. The system integrates a MobileNetV2 CNN backbone for visual feature extraction with a navigation policy trained via either Supervised Imitation Learning or Deep Reinf</w:t>
-      </w:r>
-      <w:r>
-        <w:rPr>
-          <w:rFonts w:ascii="Times New Roman" w:hAnsi="Times New Roman" w:cs="Times New Roman"/>
-          <w:sz w:val="24"/>
-        </w:rPr>
-        <w:t>orcement Learning using Proximal Policy Optimization (PPO). The complete framework is implemented within the ROS (Robot Operating System) middleware and deployed in a Gazebo simulation environment configured with three distinct environmental conditions: st</w:t>
-      </w:r>
-      <w:r>
-        <w:rPr>
-          <w:rFonts w:ascii="Times New Roman" w:hAnsi="Times New Roman" w:cs="Times New Roman"/>
-          <w:sz w:val="24"/>
-        </w:rPr>
-        <w:t>andard lighting, degraded lighting, and dynamic obstacle scenarios. Performance is evaluated using two standardized metrics — Collision Rate (CR) and Navigation Success Rate (NSR) — across 100 independent episodes per condition, providing a rigorous and re</w:t>
-      </w:r>
-      <w:r>
-        <w:rPr>
-          <w:rFonts w:ascii="Times New Roman" w:hAnsi="Times New Roman" w:cs="Times New Roman"/>
-          <w:sz w:val="24"/>
-        </w:rPr>
-        <w:t>producible assessment of real-world navigational viability [</w:t>
+        <w:t>This project proposes a lightweight deep learning-based vision-only autonomous navigation framework for a differential-drive mobile robot. The system integrates a MobileNetV2 CNN backbone for visual feature extraction with a navigation policy trained via either Supervised Imitation Learning or Deep Reinforcement Learning using Proximal Policy Optimization (PPO). The complete framework is implemented within the ROS (Robot Operating System) middleware and deployed in a Gazebo simulation environment configured with three distinct environmental conditions: standard lighting, degraded lighting, and dynamic obstacle scenarios. Performance is evaluated using two standardized metrics — Collision Rate (CR) and Navigation Success Rate (NSR) — across 100 independent episodes per condition, providing a rigorous and reproducible assessment of real-world navigational viability [</w:t>
       </w:r>
       <w:proofErr w:type="gramStart"/>
       <w:r>
@@ -1876,17 +1796,17 @@
         <w:pStyle w:val="Heading1"/>
         <w:rPr>
           <w:rFonts w:ascii="Times New Roman" w:hAnsi="Times New Roman" w:cs="Times New Roman"/>
-        </w:rPr>
-      </w:pPr>
-      <w:bookmarkStart w:id="0" w:name="_GoBack"/>
-      <w:r>
-        <w:rPr>
-          <w:rFonts w:ascii="Times New Roman" w:hAnsi="Times New Roman" w:cs="Times New Roman"/>
+          <w:color w:val="5B9BD5" w:themeColor="accent1"/>
+        </w:rPr>
+      </w:pPr>
+      <w:r>
+        <w:rPr>
+          <w:rFonts w:ascii="Times New Roman" w:hAnsi="Times New Roman" w:cs="Times New Roman"/>
+          <w:color w:val="5B9BD5" w:themeColor="accent1"/>
         </w:rPr>
         <w:t>2. Objectives</w:t>
       </w:r>
     </w:p>
-    <w:bookmarkEnd w:id="0"/>
     <w:p>
       <w:pPr>
         <w:spacing w:before="60" w:after="100"/>
@@ -1962,14 +1882,7 @@
           <w:rFonts w:ascii="Times New Roman" w:hAnsi="Times New Roman" w:cs="Times New Roman"/>
           <w:sz w:val="24"/>
         </w:rPr>
-        <w:t>To collect expert teleoperation data in Gazebo and train a MobileNetV</w:t>
-      </w:r>
-      <w:r>
-        <w:rPr>
-          <w:rFonts w:ascii="Times New Roman" w:hAnsi="Times New Roman" w:cs="Times New Roman"/>
-          <w:sz w:val="24"/>
-        </w:rPr>
-        <w:t>2-based regression policy for supervised imitation learning as a comparison baseline.</w:t>
+        <w:t>To collect expert teleoperation data in Gazebo and train a MobileNetV2-based regression policy for supervised imitation learning as a comparison baseline.</w:t>
       </w:r>
     </w:p>
     <w:p>
@@ -1999,14 +1912,7 @@
           <w:rFonts w:ascii="Times New Roman" w:hAnsi="Times New Roman" w:cs="Times New Roman"/>
           <w:sz w:val="24"/>
         </w:rPr>
-        <w:t>To train a Proximal Policy Optimization (PPO) agent using a well-engineered reward function that encourages goal-reaching while penalizing collisions</w:t>
-      </w:r>
-      <w:r>
-        <w:rPr>
-          <w:rFonts w:ascii="Times New Roman" w:hAnsi="Times New Roman" w:cs="Times New Roman"/>
-          <w:sz w:val="24"/>
-        </w:rPr>
-        <w:t xml:space="preserve"> and unnecessary rotation.</w:t>
+        <w:t>To train a Proximal Policy Optimization (PPO) agent using a well-engineered reward function that encourages goal-reaching while penalizing collisions and unnecessary rotation.</w:t>
       </w:r>
     </w:p>
     <w:p>
@@ -2096,14 +2002,7 @@
           <w:rFonts w:ascii="Times New Roman" w:hAnsi="Times New Roman" w:cs="Times New Roman"/>
           <w:sz w:val="24"/>
         </w:rPr>
-        <w:t>To identify key sim-to-real transfer challenges</w:t>
-      </w:r>
-      <w:r>
-        <w:rPr>
-          <w:rFonts w:ascii="Times New Roman" w:hAnsi="Times New Roman" w:cs="Times New Roman"/>
-          <w:sz w:val="24"/>
-        </w:rPr>
-        <w:t xml:space="preserve"> and propose concrete domain randomization and augmentation strategies for physical robot deployment.</w:t>
+        <w:t>To identify key sim-to-real transfer challenges and propose concrete domain randomization and augmentation strategies for physical robot deployment.</w:t>
       </w:r>
     </w:p>
     <w:p>
@@ -2111,11 +2010,13 @@
         <w:pStyle w:val="Heading1"/>
         <w:rPr>
           <w:rFonts w:ascii="Times New Roman" w:hAnsi="Times New Roman" w:cs="Times New Roman"/>
-        </w:rPr>
-      </w:pPr>
-      <w:r>
-        <w:rPr>
-          <w:rFonts w:ascii="Times New Roman" w:hAnsi="Times New Roman" w:cs="Times New Roman"/>
+          <w:color w:val="5B9BD5" w:themeColor="accent1"/>
+        </w:rPr>
+      </w:pPr>
+      <w:r>
+        <w:rPr>
+          <w:rFonts w:ascii="Times New Roman" w:hAnsi="Times New Roman" w:cs="Times New Roman"/>
+          <w:color w:val="5B9BD5" w:themeColor="accent1"/>
         </w:rPr>
         <w:t>3. Methodology</w:t>
       </w:r>
@@ -2164,21 +2065,7 @@
           <w:rFonts w:ascii="Times New Roman" w:hAnsi="Times New Roman" w:cs="Times New Roman"/>
           <w:sz w:val="24"/>
         </w:rPr>
-        <w:t>Camera frames are standardized</w:t>
-      </w:r>
-      <w:r>
-        <w:rPr>
-          <w:rFonts w:ascii="Times New Roman" w:hAnsi="Times New Roman" w:cs="Times New Roman"/>
-          <w:sz w:val="24"/>
-        </w:rPr>
-        <w:t xml:space="preserve"> through resolution normalization (224×224 pixels) and normalized to [−1, 1]. Data augmentation — including random brightness (factor 0.5–1.5), contrast adjustment (factor 0.8–1.2), and Gaussian noise (σ = 0–0.02) — is applied to simulate the photometric v</w:t>
-      </w:r>
-      <w:r>
-        <w:rPr>
-          <w:rFonts w:ascii="Times New Roman" w:hAnsi="Times New Roman" w:cs="Times New Roman"/>
-          <w:sz w:val="24"/>
-        </w:rPr>
-        <w:t>ariation present in degraded lighting environments.</w:t>
+        <w:t>Camera frames are standardized through resolution normalization (224×224 pixels) and normalized to [−1, 1]. Data augmentation — including random brightness (factor 0.5–1.5), contrast adjustment (factor 0.8–1.2), and Gaussian noise (σ = 0–0.02) — is applied to simulate the photometric variation present in degraded lighting environments.</w:t>
       </w:r>
     </w:p>
     <w:p>
@@ -2208,14 +2095,7 @@
           <w:rFonts w:ascii="Times New Roman" w:hAnsi="Times New Roman" w:cs="Times New Roman"/>
           <w:sz w:val="24"/>
         </w:rPr>
-        <w:t>A lightweight MobileNetV2 CNN backbone, pre-trained on ImageNet and fine-tuned during policy training, processes raw RGB frames and outputs a 1280-dimensional feat</w:t>
-      </w:r>
-      <w:r>
-        <w:rPr>
-          <w:rFonts w:ascii="Times New Roman" w:hAnsi="Times New Roman" w:cs="Times New Roman"/>
-          <w:sz w:val="24"/>
-        </w:rPr>
-        <w:t xml:space="preserve">ure vector via global average pooling. </w:t>
+        <w:t xml:space="preserve">A lightweight MobileNetV2 CNN backbone, pre-trained on ImageNet and fine-tuned during policy training, processes raw RGB frames and outputs a 1280-dimensional feature vector via global average pooling. </w:t>
       </w:r>
       <w:proofErr w:type="spellStart"/>
       <w:r>
@@ -2261,14 +2141,7 @@
           <w:rFonts w:ascii="Times New Roman" w:hAnsi="Times New Roman" w:cs="Times New Roman"/>
           <w:sz w:val="24"/>
         </w:rPr>
-        <w:t>A regressio</w:t>
-      </w:r>
-      <w:r>
-        <w:rPr>
-          <w:rFonts w:ascii="Times New Roman" w:hAnsi="Times New Roman" w:cs="Times New Roman"/>
-          <w:sz w:val="24"/>
-        </w:rPr>
-        <w:t xml:space="preserve">n head (FC layers: 256 → 64 units, </w:t>
+        <w:t xml:space="preserve">A regression head (FC layers: 256 → 64 units, </w:t>
       </w:r>
       <w:proofErr w:type="spellStart"/>
       <w:r>
@@ -2307,16 +2180,7 @@
           <w:bCs/>
           <w:sz w:val="24"/>
         </w:rPr>
-        <w:t>Navigation Policy —</w:t>
-      </w:r>
-      <w:r>
-        <w:rPr>
-          <w:rFonts w:ascii="Times New Roman" w:hAnsi="Times New Roman" w:cs="Times New Roman"/>
-          <w:b/>
-          <w:bCs/>
-          <w:sz w:val="24"/>
-        </w:rPr>
-        <w:t xml:space="preserve"> Approach B (PPO-DRL): </w:t>
+        <w:t xml:space="preserve">Navigation Policy — Approach B (PPO-DRL): </w:t>
       </w:r>
       <w:r>
         <w:rPr>
@@ -2357,14 +2221,7 @@
           <w:rFonts w:ascii="Times New Roman" w:hAnsi="Times New Roman" w:cs="Times New Roman"/>
           <w:sz w:val="24"/>
         </w:rPr>
-        <w:t xml:space="preserve"> − 0.01 × |ω|. Training begins in Environment 1 and progressively incorporates Environments 2</w:t>
-      </w:r>
-      <w:r>
-        <w:rPr>
-          <w:rFonts w:ascii="Times New Roman" w:hAnsi="Times New Roman" w:cs="Times New Roman"/>
-          <w:sz w:val="24"/>
-        </w:rPr>
-        <w:t xml:space="preserve"> and 3 once a 70% NSR baseline is achieved.</w:t>
+        <w:t xml:space="preserve"> − 0.01 × |ω|. Training begins in Environment 1 and progressively incorporates Environments 2 and 3 once a 70% NSR baseline is achieved.</w:t>
       </w:r>
     </w:p>
     <w:p>
@@ -2426,14 +2283,7 @@
           <w:rFonts w:ascii="Times New Roman" w:hAnsi="Times New Roman" w:cs="Times New Roman"/>
           <w:sz w:val="24"/>
         </w:rPr>
-        <w:t>] in the robot's local frame, computed at each 10 Hz control step, eliminating the ne</w:t>
-      </w:r>
-      <w:r>
-        <w:rPr>
-          <w:rFonts w:ascii="Times New Roman" w:hAnsi="Times New Roman" w:cs="Times New Roman"/>
-          <w:sz w:val="24"/>
-        </w:rPr>
-        <w:t>ed for global localization.</w:t>
+        <w:t>] in the robot's local frame, computed at each 10 Hz control step, eliminating the need for global localization.</w:t>
       </w:r>
     </w:p>
     <w:p>
@@ -2479,14 +2329,7 @@
           <w:rFonts w:ascii="Times New Roman" w:hAnsi="Times New Roman" w:cs="Times New Roman"/>
           <w:sz w:val="24"/>
         </w:rPr>
-        <w:t xml:space="preserve">; (E2) degraded lighting at 20% ambient </w:t>
-      </w:r>
-      <w:r>
-        <w:rPr>
-          <w:rFonts w:ascii="Times New Roman" w:hAnsi="Times New Roman" w:cs="Times New Roman"/>
-          <w:sz w:val="24"/>
-        </w:rPr>
-        <w:t xml:space="preserve">intensity with randomized point lights; (E3) dynamic obstacles — three pedestrian agents at 1.0–1.5 m/s. Each </w:t>
+        <w:t xml:space="preserve">; (E2) degraded lighting at 20% ambient intensity with randomized point lights; (E3) dynamic obstacles — three pedestrian agents at 1.0–1.5 m/s. Each </w:t>
       </w:r>
       <w:r>
         <w:rPr>
@@ -2496,15 +2339,55 @@
         <w:lastRenderedPageBreak/>
         <w:t>condition runs 100 independent episodes. CR and NSR are compared between Approach A and Approach B using a two-proportion z-test (α = 0.05).</w:t>
       </w:r>
-    </w:p>
-    <w:p>
-      <w:pPr>
-        <w:spacing w:before="100"/>
-        <w:rPr>
-          <w:rFonts w:ascii="Times New Roman" w:hAnsi="Times New Roman" w:cs="Times New Roman"/>
-          <w:sz w:val="24"/>
-        </w:rPr>
-      </w:pPr>
+      <w:r>
+        <w:rPr>
+          <w:rFonts w:ascii="Times New Roman" w:hAnsi="Times New Roman" w:cs="Times New Roman"/>
+          <w:sz w:val="24"/>
+        </w:rPr>
+        <w:br/>
+      </w:r>
+    </w:p>
+    <w:p>
+      <w:pPr>
+        <w:spacing w:before="100" w:after="240"/>
+        <w:jc w:val="center"/>
+        <w:rPr>
+          <w:rFonts w:ascii="Times New Roman" w:hAnsi="Times New Roman" w:cs="Times New Roman"/>
+          <w:sz w:val="24"/>
+        </w:rPr>
+      </w:pPr>
+      <w:r>
+        <w:rPr>
+          <w:rFonts w:ascii="Times New Roman" w:hAnsi="Times New Roman" w:cs="Times New Roman"/>
+          <w:sz w:val="24"/>
+        </w:rPr>
+        <w:pict>
+          <v:shapetype id="_x0000_t75" coordsize="21600,21600" o:spt="75" o:preferrelative="t" path="m@4@5l@4@11@9@11@9@5xe" filled="f" stroked="f">
+            <v:stroke joinstyle="miter"/>
+            <v:formulas>
+              <v:f eqn="if lineDrawn pixelLineWidth 0"/>
+              <v:f eqn="sum @0 1 0"/>
+              <v:f eqn="sum 0 0 @1"/>
+              <v:f eqn="prod @2 1 2"/>
+              <v:f eqn="prod @3 21600 pixelWidth"/>
+              <v:f eqn="prod @3 21600 pixelHeight"/>
+              <v:f eqn="sum @0 0 1"/>
+              <v:f eqn="prod @6 1 2"/>
+              <v:f eqn="prod @7 21600 pixelWidth"/>
+              <v:f eqn="sum @8 21600 0"/>
+              <v:f eqn="prod @7 21600 pixelHeight"/>
+              <v:f eqn="sum @10 21600 0"/>
+            </v:formulas>
+            <v:path o:extrusionok="f" gradientshapeok="t" o:connecttype="rect"/>
+            <o:lock v:ext="edit" aspectratio="t"/>
+          </v:shapetype>
+          <v:shape id="_x0000_i1035" type="#_x0000_t75" style="width:477.75pt;height:344.25pt">
+            <v:imagedata r:id="rId6" o:title="Capstone-Methodology-Page-3.drawio (1)"/>
+          </v:shape>
+        </w:pict>
+      </w:r>
+      <w:bookmarkStart w:id="0" w:name="_GoBack"/>
+      <w:bookmarkEnd w:id="0"/>
     </w:p>
     <w:p>
       <w:pPr>
@@ -2522,16 +2405,7 @@
           <w:iCs/>
           <w:szCs w:val="20"/>
         </w:rPr>
-        <w:t>Figu</w:t>
-      </w:r>
-      <w:r>
-        <w:rPr>
-          <w:rFonts w:ascii="Times New Roman" w:hAnsi="Times New Roman" w:cs="Times New Roman"/>
-          <w:i/>
-          <w:iCs/>
-          <w:szCs w:val="20"/>
-        </w:rPr>
-        <w:t>re 1: Proposed System Architecture for Vision-Only Autonomous Navigation</w:t>
+        <w:t>Figure 1: Proposed System Architecture for Vision-Only Autonomous Navigation</w:t>
       </w:r>
     </w:p>
     <w:p>
@@ -2547,11 +2421,13 @@
         <w:pStyle w:val="Heading1"/>
         <w:rPr>
           <w:rFonts w:ascii="Times New Roman" w:hAnsi="Times New Roman" w:cs="Times New Roman"/>
-        </w:rPr>
-      </w:pPr>
-      <w:r>
-        <w:rPr>
-          <w:rFonts w:ascii="Times New Roman" w:hAnsi="Times New Roman" w:cs="Times New Roman"/>
+          <w:color w:val="5B9BD5" w:themeColor="accent1"/>
+        </w:rPr>
+      </w:pPr>
+      <w:r>
+        <w:rPr>
+          <w:rFonts w:ascii="Times New Roman" w:hAnsi="Times New Roman" w:cs="Times New Roman"/>
+          <w:color w:val="5B9BD5" w:themeColor="accent1"/>
         </w:rPr>
         <w:t>4. Expected Outcomes</w:t>
       </w:r>
@@ -2574,14 +2450,7 @@
           <w:rFonts w:ascii="Times New Roman" w:hAnsi="Times New Roman" w:cs="Times New Roman"/>
           <w:sz w:val="24"/>
         </w:rPr>
-        <w:t>A fully functional deep learning navigation system (Imitation Learning and DRL/PPO variants) capable of autonomous goal-directed operation in a Gazebo simulation</w:t>
-      </w:r>
-      <w:r>
-        <w:rPr>
-          <w:rFonts w:ascii="Times New Roman" w:hAnsi="Times New Roman" w:cs="Times New Roman"/>
-          <w:sz w:val="24"/>
-        </w:rPr>
-        <w:t xml:space="preserve"> environment using only a single monocular RGB camera.</w:t>
+        <w:t>A fully functional deep learning navigation system (Imitation Learning and DRL/PPO variants) capable of autonomous goal-directed operation in a Gazebo simulation environment using only a single monocular RGB camera.</w:t>
       </w:r>
     </w:p>
     <w:p>
@@ -2602,14 +2471,7 @@
           <w:rFonts w:ascii="Times New Roman" w:hAnsi="Times New Roman" w:cs="Times New Roman"/>
           <w:sz w:val="24"/>
         </w:rPr>
-        <w:t>Quantified CR and NSR results across three environmental conditions (standard lighting, degraded lighting, dynamic obstacles), providing the first systematic lighting-aware evaluation within a ROS–Gaze</w:t>
-      </w:r>
-      <w:r>
-        <w:rPr>
-          <w:rFonts w:ascii="Times New Roman" w:hAnsi="Times New Roman" w:cs="Times New Roman"/>
-          <w:sz w:val="24"/>
-        </w:rPr>
-        <w:t>bo framework.</w:t>
+        <w:t>Quantified CR and NSR results across three environmental conditions (standard lighting, degraded lighting, dynamic obstacles), providing the first systematic lighting-aware evaluation within a ROS–Gazebo framework.</w:t>
       </w:r>
     </w:p>
     <w:p>
@@ -2651,14 +2513,7 @@
           <w:rFonts w:ascii="Times New Roman" w:hAnsi="Times New Roman" w:cs="Times New Roman"/>
           <w:sz w:val="24"/>
         </w:rPr>
-        <w:t>A comparative analysis between Imitation Learn</w:t>
-      </w:r>
-      <w:r>
-        <w:rPr>
-          <w:rFonts w:ascii="Times New Roman" w:hAnsi="Times New Roman" w:cs="Times New Roman"/>
-          <w:sz w:val="24"/>
-        </w:rPr>
-        <w:t>ing and PPO-DRL policy approaches, identifying the superior paradigm for low-cost vision-only navigation under each environmental condition.</w:t>
+        <w:t>A comparative analysis between Imitation Learning and PPO-DRL policy approaches, identifying the superior paradigm for low-cost vision-only navigation under each environmental condition.</w:t>
       </w:r>
     </w:p>
     <w:p>
@@ -2679,14 +2534,7 @@
           <w:rFonts w:ascii="Times New Roman" w:hAnsi="Times New Roman" w:cs="Times New Roman"/>
           <w:sz w:val="24"/>
         </w:rPr>
-        <w:t>Benchmark performance showing the vision-only framework achieves competitive CR and NSR against sensor-fused baseli</w:t>
-      </w:r>
-      <w:r>
-        <w:rPr>
-          <w:rFonts w:ascii="Times New Roman" w:hAnsi="Times New Roman" w:cs="Times New Roman"/>
-          <w:sz w:val="24"/>
-        </w:rPr>
-        <w:t>nes from the reviewed literature, at a fraction of the hardware cost.</w:t>
+        <w:t>Benchmark performance showing the vision-only framework achieves competitive CR and NSR against sensor-fused baselines from the reviewed literature, at a fraction of the hardware cost.</w:t>
       </w:r>
     </w:p>
     <w:p>
@@ -2694,12 +2542,15 @@
         <w:pStyle w:val="Heading1"/>
         <w:rPr>
           <w:rFonts w:ascii="Times New Roman" w:hAnsi="Times New Roman" w:cs="Times New Roman"/>
-        </w:rPr>
-      </w:pPr>
-      <w:r>
-        <w:rPr>
-          <w:rFonts w:ascii="Times New Roman" w:hAnsi="Times New Roman" w:cs="Times New Roman"/>
-        </w:rPr>
+          <w:color w:val="5B9BD5" w:themeColor="accent1"/>
+        </w:rPr>
+      </w:pPr>
+      <w:r>
+        <w:rPr>
+          <w:rFonts w:ascii="Times New Roman" w:hAnsi="Times New Roman" w:cs="Times New Roman"/>
+          <w:color w:val="5B9BD5" w:themeColor="accent1"/>
+        </w:rPr>
+        <w:lastRenderedPageBreak/>
         <w:t>5. Complex Engineering Problem Mapping</w:t>
       </w:r>
     </w:p>
@@ -2778,14 +2629,7 @@
           <w:rFonts w:ascii="Times New Roman" w:hAnsi="Times New Roman" w:cs="Times New Roman"/>
           <w:sz w:val="24"/>
         </w:rPr>
-        <w:t xml:space="preserve">Required for PPO reward function formulation, convergence optimization, and statistical hypothesis testing (z-test) of CR </w:t>
-      </w:r>
-      <w:r>
-        <w:rPr>
-          <w:rFonts w:ascii="Times New Roman" w:hAnsi="Times New Roman" w:cs="Times New Roman"/>
-          <w:sz w:val="24"/>
-        </w:rPr>
-        <w:t>and NSR results.</w:t>
+        <w:t>Required for PPO reward function formulation, convergence optimization, and statistical hypothesis testing (z-test) of CR and NSR results.</w:t>
       </w:r>
     </w:p>
     <w:p>
@@ -2845,14 +2689,7 @@
           <w:rFonts w:ascii="Times New Roman" w:hAnsi="Times New Roman" w:cs="Times New Roman"/>
           <w:sz w:val="24"/>
         </w:rPr>
-        <w:t>CNN architectures (MobileNetV2), deep reinforcemen</w:t>
-      </w:r>
-      <w:r>
-        <w:rPr>
-          <w:rFonts w:ascii="Times New Roman" w:hAnsi="Times New Roman" w:cs="Times New Roman"/>
-          <w:sz w:val="24"/>
-        </w:rPr>
-        <w:t>t learning (PPO), imitation learning, and ROS middleware integration.</w:t>
+        <w:t>CNN architectures (MobileNetV2), deep reinforcement learning (PPO), imitation learning, and ROS middleware integration.</w:t>
       </w:r>
     </w:p>
     <w:p>
@@ -2905,16 +2742,7 @@
           <w:bCs/>
           <w:sz w:val="24"/>
         </w:rPr>
-        <w:t>W</w:t>
-      </w:r>
-      <w:r>
-        <w:rPr>
-          <w:rFonts w:ascii="Times New Roman" w:hAnsi="Times New Roman" w:cs="Times New Roman"/>
-          <w:b/>
-          <w:bCs/>
-          <w:sz w:val="24"/>
-        </w:rPr>
-        <w:t xml:space="preserve">K6 (Engineering Practice): </w:t>
+        <w:t xml:space="preserve">WK6 (Engineering Practice): </w:t>
       </w:r>
       <w:r>
         <w:rPr>
@@ -2967,14 +2795,7 @@
           <w:rFonts w:ascii="Times New Roman" w:hAnsi="Times New Roman" w:cs="Times New Roman"/>
           <w:sz w:val="24"/>
         </w:rPr>
-        <w:t>Understanding ethical implications of deploying autonomous systems</w:t>
-      </w:r>
-      <w:r>
-        <w:rPr>
-          <w:rFonts w:ascii="Times New Roman" w:hAnsi="Times New Roman" w:cs="Times New Roman"/>
-          <w:sz w:val="24"/>
-        </w:rPr>
-        <w:t xml:space="preserve"> in human-occupied environments and ensuring fail-safe collision avoidance behavior.</w:t>
+        <w:t>Understanding ethical implications of deploying autonomous systems in human-occupied environments and ensuring fail-safe collision avoidance behavior.</w:t>
       </w:r>
     </w:p>
     <w:p>
@@ -3031,16 +2852,7 @@
           <w:bCs/>
           <w:sz w:val="24"/>
         </w:rPr>
-        <w:t>Mapping with Comp</w:t>
-      </w:r>
-      <w:r>
-        <w:rPr>
-          <w:rFonts w:ascii="Times New Roman" w:hAnsi="Times New Roman" w:cs="Times New Roman"/>
-          <w:b/>
-          <w:bCs/>
-          <w:sz w:val="24"/>
-        </w:rPr>
-        <w:t>lex Engineering Problems (WP):</w:t>
+        <w:t>Mapping with Complex Engineering Problems (WP):</w:t>
       </w:r>
     </w:p>
     <w:p>
@@ -3130,14 +2942,7 @@
           <w:rFonts w:ascii="Times New Roman" w:hAnsi="Times New Roman" w:cs="Times New Roman"/>
           <w:sz w:val="24"/>
         </w:rPr>
-        <w:t>Requires systematic ablation across three environmental conditions with statistical analysis to draw</w:t>
-      </w:r>
-      <w:r>
-        <w:rPr>
-          <w:rFonts w:ascii="Times New Roman" w:hAnsi="Times New Roman" w:cs="Times New Roman"/>
-          <w:sz w:val="24"/>
-        </w:rPr>
-        <w:t xml:space="preserve"> valid performance conclusions.</w:t>
+        <w:t>Requires systematic ablation across three environmental conditions with statistical analysis to draw valid performance conclusions.</w:t>
       </w:r>
     </w:p>
     <w:p>
@@ -3190,16 +2995,7 @@
           <w:bCs/>
           <w:sz w:val="24"/>
         </w:rPr>
-        <w:t>WP5 (Applicable Co</w:t>
-      </w:r>
-      <w:r>
-        <w:rPr>
-          <w:rFonts w:ascii="Times New Roman" w:hAnsi="Times New Roman" w:cs="Times New Roman"/>
-          <w:b/>
-          <w:bCs/>
-          <w:sz w:val="24"/>
-        </w:rPr>
-        <w:t xml:space="preserve">des): </w:t>
+        <w:t xml:space="preserve">WP5 (Applicable Codes): </w:t>
       </w:r>
       <w:r>
         <w:rPr>
@@ -3236,14 +3032,7 @@
           <w:rFonts w:ascii="Times New Roman" w:hAnsi="Times New Roman" w:cs="Times New Roman"/>
           <w:sz w:val="24"/>
         </w:rPr>
-        <w:t>Relevant to robotics engineers, logistics operators, healthcare practitioners, embedded hardware develo</w:t>
-      </w:r>
-      <w:r>
-        <w:rPr>
-          <w:rFonts w:ascii="Times New Roman" w:hAnsi="Times New Roman" w:cs="Times New Roman"/>
-          <w:sz w:val="24"/>
-        </w:rPr>
-        <w:t>pers, and end-users in developing regions.</w:t>
+        <w:t>Relevant to robotics engineers, logistics operators, healthcare practitioners, embedded hardware developers, and end-users in developing regions.</w:t>
       </w:r>
     </w:p>
     <w:p>
@@ -3300,16 +3089,7 @@
           <w:bCs/>
           <w:sz w:val="24"/>
         </w:rPr>
-        <w:t>Mapping with Complex Engineering Ac</w:t>
-      </w:r>
-      <w:r>
-        <w:rPr>
-          <w:rFonts w:ascii="Times New Roman" w:hAnsi="Times New Roman" w:cs="Times New Roman"/>
-          <w:b/>
-          <w:bCs/>
-          <w:sz w:val="24"/>
-        </w:rPr>
-        <w:t>tivities (EA):</w:t>
+        <w:t>Mapping with Complex Engineering Activities (EA):</w:t>
       </w:r>
     </w:p>
     <w:p>
@@ -3332,6 +3112,7 @@
           <w:bCs/>
           <w:sz w:val="24"/>
         </w:rPr>
+        <w:lastRenderedPageBreak/>
         <w:t xml:space="preserve">EA1 (Range of Resources): </w:t>
       </w:r>
       <w:r>
@@ -3369,14 +3150,7 @@
           <w:rFonts w:ascii="Times New Roman" w:hAnsi="Times New Roman" w:cs="Times New Roman"/>
           <w:sz w:val="24"/>
         </w:rPr>
-        <w:t>Manages integration between the vis</w:t>
-      </w:r>
-      <w:r>
-        <w:rPr>
-          <w:rFonts w:ascii="Times New Roman" w:hAnsi="Times New Roman" w:cs="Times New Roman"/>
-          <w:sz w:val="24"/>
-        </w:rPr>
-        <w:t>ual perception module, DRL policy network, ROS computation graph, and Gazebo physics engine with real-time message passing.</w:t>
+        <w:t>Manages integration between the visual perception module, DRL policy network, ROS computation graph, and Gazebo physics engine with real-time message passing.</w:t>
       </w:r>
     </w:p>
     <w:p>
@@ -3406,14 +3180,7 @@
           <w:rFonts w:ascii="Times New Roman" w:hAnsi="Times New Roman" w:cs="Times New Roman"/>
           <w:sz w:val="24"/>
         </w:rPr>
-        <w:t>Introduces a systematic comparison of Imitation Learning and DRL/PPO approaches on a common ROS–Gazebo platform ev</w:t>
-      </w:r>
-      <w:r>
-        <w:rPr>
-          <w:rFonts w:ascii="Times New Roman" w:hAnsi="Times New Roman" w:cs="Times New Roman"/>
-          <w:sz w:val="24"/>
-        </w:rPr>
-        <w:t>aluated across three environmental conditions — a combination not previously reported in Q1/Q2 literature.</w:t>
+        <w:t>Introduces a systematic comparison of Imitation Learning and DRL/PPO approaches on a common ROS–Gazebo platform evaluated across three environmental conditions — a combination not previously reported in Q1/Q2 literature.</w:t>
       </w:r>
     </w:p>
     <w:p>
@@ -3443,14 +3210,7 @@
           <w:rFonts w:ascii="Times New Roman" w:hAnsi="Times New Roman" w:cs="Times New Roman"/>
           <w:sz w:val="24"/>
         </w:rPr>
-        <w:t>Reduces the cost barrier of autonomous navigation, enabling broader adoption in healthcare assistance, last-mile logis</w:t>
-      </w:r>
-      <w:r>
-        <w:rPr>
-          <w:rFonts w:ascii="Times New Roman" w:hAnsi="Times New Roman" w:cs="Times New Roman"/>
-          <w:sz w:val="24"/>
-        </w:rPr>
-        <w:t>tics, and accessible robotic mobility in developing regions.</w:t>
+        <w:t>Reduces the cost barrier of autonomous navigation, enabling broader adoption in healthcare assistance, last-mile logistics, and accessible robotic mobility in developing regions.</w:t>
       </w:r>
     </w:p>
     <w:p>
@@ -3480,14 +3240,7 @@
           <w:rFonts w:ascii="Times New Roman" w:hAnsi="Times New Roman" w:cs="Times New Roman"/>
           <w:sz w:val="24"/>
         </w:rPr>
-        <w:t>Extends established DRL and computer vision navigation challenges through a novel low-cost simulation-first methodology with rigorous multi-condition environmental ev</w:t>
-      </w:r>
-      <w:r>
-        <w:rPr>
-          <w:rFonts w:ascii="Times New Roman" w:hAnsi="Times New Roman" w:cs="Times New Roman"/>
-          <w:sz w:val="24"/>
-        </w:rPr>
-        <w:t>aluation.</w:t>
+        <w:t>Extends established DRL and computer vision navigation challenges through a novel low-cost simulation-first methodology with rigorous multi-condition environmental evaluation.</w:t>
       </w:r>
     </w:p>
     <w:p>
@@ -3495,11 +3248,13 @@
         <w:pStyle w:val="Heading1"/>
         <w:rPr>
           <w:rFonts w:ascii="Times New Roman" w:hAnsi="Times New Roman" w:cs="Times New Roman"/>
-        </w:rPr>
-      </w:pPr>
-      <w:r>
-        <w:rPr>
-          <w:rFonts w:ascii="Times New Roman" w:hAnsi="Times New Roman" w:cs="Times New Roman"/>
+          <w:color w:val="5B9BD5" w:themeColor="accent1"/>
+        </w:rPr>
+      </w:pPr>
+      <w:r>
+        <w:rPr>
+          <w:rFonts w:ascii="Times New Roman" w:hAnsi="Times New Roman" w:cs="Times New Roman"/>
+          <w:color w:val="5B9BD5" w:themeColor="accent1"/>
         </w:rPr>
         <w:t>6. References</w:t>
       </w:r>
@@ -3509,10 +3264,7 @@
         <w:pStyle w:val="NormalWeb"/>
       </w:pPr>
       <w:r>
-        <w:t xml:space="preserve"> </w:t>
-      </w:r>
-      <w:r>
-        <w:t xml:space="preserve">[1] Sharma, B., </w:t>
+        <w:t xml:space="preserve"> [1] Sharma, B., </w:t>
       </w:r>
       <w:proofErr w:type="spellStart"/>
       <w:r>
@@ -3539,7 +3291,7 @@
       <w:r>
         <w:t xml:space="preserve">. IEEE Robotics and Automation Letters. </w:t>
       </w:r>
-      <w:hyperlink r:id="rId6" w:history="1">
+      <w:hyperlink r:id="rId7" w:history="1">
         <w:r>
           <w:rPr>
             <w:rStyle w:val="Hyperlink"/>
@@ -3553,7 +3305,6 @@
         <w:pStyle w:val="NormalWeb"/>
       </w:pPr>
       <w:r>
-        <w:lastRenderedPageBreak/>
         <w:t xml:space="preserve">[2] Kim, J., Sim, J., Kim, W., </w:t>
       </w:r>
       <w:proofErr w:type="spellStart"/>
@@ -3590,7 +3341,7 @@
       <w:r>
         <w:t xml:space="preserve">. IEEE Transactions on Cybernetics. </w:t>
       </w:r>
-      <w:hyperlink r:id="rId7" w:history="1">
+      <w:hyperlink r:id="rId8" w:history="1">
         <w:r>
           <w:rPr>
             <w:rStyle w:val="Hyperlink"/>
@@ -3665,7 +3416,7 @@
       <w:r>
         <w:t xml:space="preserve">. IEEE Robotics and Automation Letters. </w:t>
       </w:r>
-      <w:hyperlink r:id="rId8" w:history="1">
+      <w:hyperlink r:id="rId9" w:history="1">
         <w:r>
           <w:rPr>
             <w:rStyle w:val="Hyperlink"/>
@@ -3740,7 +3491,7 @@
       <w:r>
         <w:t xml:space="preserve">. IEEE Robotics and Automation Letters. </w:t>
       </w:r>
-      <w:hyperlink r:id="rId9" w:history="1">
+      <w:hyperlink r:id="rId10" w:history="1">
         <w:r>
           <w:rPr>
             <w:rStyle w:val="Hyperlink"/>
@@ -3754,6 +3505,7 @@
         <w:pStyle w:val="NormalWeb"/>
       </w:pPr>
       <w:r>
+        <w:lastRenderedPageBreak/>
         <w:t xml:space="preserve">[10] Wang, X., Tan, Y. R., Leong, W., Huang, S., </w:t>
       </w:r>
       <w:proofErr w:type="spellStart"/>
@@ -3773,7 +3525,7 @@
       <w:r>
         <w:t xml:space="preserve">. IEEE Robotics and Automation Letters. </w:t>
       </w:r>
-      <w:hyperlink r:id="rId10" w:history="1">
+      <w:hyperlink r:id="rId11" w:history="1">
         <w:r>
           <w:rPr>
             <w:rStyle w:val="Hyperlink"/>
@@ -4449,6 +4201,7 @@
   <w:style w:type="character" w:default="1" w:styleId="DefaultParagraphFont">
     <w:name w:val="Default Paragraph Font"/>
     <w:uiPriority w:val="1"/>
+    <w:semiHidden/>
     <w:unhideWhenUsed/>
   </w:style>
   <w:style w:type="table" w:default="1" w:styleId="TableNormal">

</xml_diff>